<commit_message>
feat(web,server-ts,server): knowledge gaps answer UI, activity feed, markdown, templates, gap research scheduler
</commit_message>
<xml_diff>
--- a/packages/server/heurion_worker/templates/docx/case_summary.docx
+++ b/packages/server/heurion_worker/templates/docx/case_summary.docx
@@ -4,100 +4,303 @@
   <w:body>
     <w:p>
       <w:pPr>
-        <w:pStyle w:val="Title"/>
-        <w:jc w:val="center"/>
+        <w:spacing w:after="80"/>
+        <w:jc w:val="left"/>
       </w:pPr>
       <w:r>
+        <w:rPr>
+          <w:rFonts w:ascii="Calibri" w:hAnsi="Calibri" w:eastAsia="Calibri"/>
+          <w:b/>
+          <w:color w:val="0F172A"/>
+          <w:sz w:val="48"/>
+        </w:rPr>
         <w:t>病例总结 / Case Summary</w:t>
+      </w:r>
+    </w:p>
+    <w:tbl>
+      <w:tblPr>
+        <w:tblW w:type="auto" w:w="0"/>
+        <w:jc w:val="left"/>
+        <w:tblLook w:firstColumn="1" w:firstRow="1" w:lastColumn="0" w:lastRow="0" w:noHBand="0" w:noVBand="1" w:val="04A0"/>
+      </w:tblPr>
+      <w:tblGrid>
+        <w:gridCol w:w="9648"/>
+      </w:tblGrid>
+      <w:tr>
+        <w:trPr>
+          <w:trHeight w:val="80"/>
+        </w:trPr>
+        <w:tc>
+          <w:tcPr>
+            <w:tcW w:type="dxa" w:w="3600"/>
+            <w:shd w:fill="0EA5E9"/>
+            <w:tcMar>
+              <w:top w:w="0" w:type="dxa"/>
+              <w:left w:w="0" w:type="dxa"/>
+              <w:bottom w:w="0" w:type="dxa"/>
+              <w:right w:w="0" w:type="dxa"/>
+            </w:tcMar>
+          </w:tcPr>
+          <w:p/>
+        </w:tc>
+      </w:tr>
+    </w:tbl>
+    <w:p/>
+    <w:p>
+      <w:pPr>
+        <w:spacing w:before="360" w:after="120"/>
+      </w:pPr>
+      <w:r>
+        <w:rPr>
+          <w:rFonts w:ascii="Calibri" w:hAnsi="Calibri" w:eastAsia="Calibri"/>
+          <w:b/>
+          <w:color w:val="0EA5E9"/>
+          <w:sz w:val="28"/>
+        </w:rPr>
+        <w:t>患者信息 / Patient Information</w:t>
       </w:r>
     </w:p>
     <w:p>
       <w:pPr>
-        <w:pStyle w:val="Heading1"/>
+        <w:spacing w:line="360" w:lineRule="auto"/>
+      </w:pPr>
+    </w:p>
+    <w:p>
+      <w:pPr>
+        <w:spacing w:after="80"/>
       </w:pPr>
       <w:r>
-        <w:t>患者信息</w:t>
+        <w:rPr>
+          <w:rFonts w:ascii="Calibri" w:hAnsi="Calibri" w:eastAsia="Calibri"/>
+          <w:b w:val="0"/>
+          <w:color w:val="64748B"/>
+          <w:sz w:val="22"/>
+        </w:rPr>
+        <w:t xml:space="preserve">患者代号 / Initials: </w:t>
       </w:r>
-    </w:p>
-    <w:p>
       <w:r>
         <w:rPr>
+          <w:rFonts w:ascii="Calibri" w:hAnsi="Calibri" w:eastAsia="Calibri"/>
           <w:b/>
+          <w:color w:val="0F172A"/>
+          <w:sz w:val="22"/>
         </w:rPr>
-        <w:t xml:space="preserve">患者代号: </w:t>
-      </w:r>
-      <w:r>
         <w:t>{{patient_initials}}</w:t>
       </w:r>
     </w:p>
     <w:p>
+      <w:pPr>
+        <w:spacing w:after="80"/>
+      </w:pPr>
       <w:r>
         <w:rPr>
-          <w:b/>
+          <w:rFonts w:ascii="Calibri" w:hAnsi="Calibri" w:eastAsia="Calibri"/>
+          <w:b w:val="0"/>
+          <w:color w:val="64748B"/>
+          <w:sz w:val="22"/>
         </w:rPr>
-        <w:t xml:space="preserve">年龄 / 性别: </w:t>
+        <w:t xml:space="preserve">年龄 / Age: </w:t>
       </w:r>
       <w:r>
-        <w:t>{{age}} / {{sex}}</w:t>
+        <w:rPr>
+          <w:rFonts w:ascii="Calibri" w:hAnsi="Calibri" w:eastAsia="Calibri"/>
+          <w:b/>
+          <w:color w:val="0F172A"/>
+          <w:sz w:val="22"/>
+        </w:rPr>
+        <w:t>{{age}}</w:t>
+      </w:r>
+      <w:r>
+        <w:rPr>
+          <w:rFonts w:ascii="Calibri" w:hAnsi="Calibri" w:eastAsia="Calibri"/>
+          <w:b w:val="0"/>
+          <w:color w:val="64748B"/>
+          <w:sz w:val="22"/>
+        </w:rPr>
+        <w:t xml:space="preserve">  ·  性别 / Sex: {{sex}}</w:t>
       </w:r>
     </w:p>
     <w:p>
+      <w:pPr>
+        <w:spacing w:after="80"/>
+      </w:pPr>
       <w:r>
         <w:rPr>
-          <w:b/>
+          <w:rFonts w:ascii="Calibri" w:hAnsi="Calibri" w:eastAsia="Calibri"/>
+          <w:b w:val="0"/>
+          <w:color w:val="64748B"/>
+          <w:sz w:val="22"/>
         </w:rPr>
-        <w:t xml:space="preserve">诊断: </w:t>
+        <w:t xml:space="preserve">诊断 / Diagnosis: </w:t>
       </w:r>
       <w:r>
+        <w:rPr>
+          <w:rFonts w:ascii="Calibri" w:hAnsi="Calibri" w:eastAsia="Calibri"/>
+          <w:b/>
+          <w:color w:val="0F172A"/>
+          <w:sz w:val="22"/>
+        </w:rPr>
         <w:t>{{diagnosis}}</w:t>
       </w:r>
     </w:p>
     <w:p>
       <w:pPr>
-        <w:pStyle w:val="Heading1"/>
+        <w:spacing w:before="360" w:after="120"/>
       </w:pPr>
       <w:r>
-        <w:t>主要发现</w:t>
+        <w:rPr>
+          <w:rFonts w:ascii="Calibri" w:hAnsi="Calibri" w:eastAsia="Calibri"/>
+          <w:b/>
+          <w:color w:val="0EA5E9"/>
+          <w:sz w:val="28"/>
+        </w:rPr>
+        <w:t>主要发现 / Key Findings</w:t>
       </w:r>
     </w:p>
     <w:p>
+      <w:pPr>
+        <w:spacing w:line="360" w:lineRule="auto" w:after="240"/>
+      </w:pPr>
       <w:r>
+        <w:rPr>
+          <w:rFonts w:ascii="Calibri" w:hAnsi="Calibri" w:eastAsia="Calibri"/>
+          <w:b w:val="0"/>
+          <w:color w:val="94A3B8"/>
+          <w:sz w:val="22"/>
+        </w:rPr>
         <w:t>{{findings_html}}</w:t>
       </w:r>
     </w:p>
     <w:p>
       <w:pPr>
-        <w:pStyle w:val="Heading1"/>
+        <w:spacing w:before="360" w:after="120"/>
       </w:pPr>
       <w:r>
-        <w:t>治疗与计划</w:t>
+        <w:rPr>
+          <w:rFonts w:ascii="Calibri" w:hAnsi="Calibri" w:eastAsia="Calibri"/>
+          <w:b/>
+          <w:color w:val="0EA5E9"/>
+          <w:sz w:val="28"/>
+        </w:rPr>
+        <w:t>治疗与计划 / Treatment &amp; Plan</w:t>
       </w:r>
     </w:p>
     <w:p>
+      <w:pPr>
+        <w:spacing w:line="360" w:lineRule="auto" w:after="240"/>
+      </w:pPr>
       <w:r>
+        <w:rPr>
+          <w:rFonts w:ascii="Calibri" w:hAnsi="Calibri" w:eastAsia="Calibri"/>
+          <w:b w:val="0"/>
+          <w:color w:val="94A3B8"/>
+          <w:sz w:val="22"/>
+        </w:rPr>
         <w:t>{{treatment_plan}}</w:t>
       </w:r>
     </w:p>
     <w:p/>
     <w:p>
       <w:pPr>
-        <w:jc w:val="right"/>
+        <w:jc w:val="left"/>
       </w:pPr>
       <w:r>
         <w:rPr>
-          <w:i/>
+          <w:rFonts w:ascii="Calibri" w:hAnsi="Calibri" w:eastAsia="Calibri"/>
+          <w:b w:val="0"/>
+          <w:color w:val="94A3B8"/>
+          <w:sz w:val="18"/>
         </w:rPr>
-        <w:t>生成时间: {{generated_at}}</w:t>
+        <w:t>生成时间 / Generated: {{generated_at}}</w:t>
       </w:r>
     </w:p>
     <w:sectPr>
+      <w:headerReference w:type="default" r:id="rId9"/>
+      <w:footerReference w:type="default" r:id="rId10"/>
       <w:pgSz w:w="12240" w:h="15840"/>
-      <w:pgMar w:top="1440" w:right="1800" w:bottom="1440" w:left="1800" w:header="720" w:footer="720" w:gutter="0"/>
+      <w:pgMar w:top="1152" w:right="1296" w:bottom="1152" w:left="1296" w:header="720" w:footer="720" w:gutter="0"/>
       <w:cols w:space="720"/>
       <w:docGrid w:linePitch="360"/>
     </w:sectPr>
   </w:body>
 </w:document>
+</file>
+
+<file path=word/footer1.xml><?xml version="1.0" encoding="utf-8"?>
+<w:ftr xmlns:m="http://schemas.openxmlformats.org/officeDocument/2006/math" xmlns:mc="http://schemas.openxmlformats.org/markup-compatibility/2006" xmlns:mo="http://schemas.microsoft.com/office/mac/office/2008/main" xmlns:mv="urn:schemas-microsoft-com:mac:vml" xmlns:o="urn:schemas-microsoft-com:office:office" xmlns:r="http://schemas.openxmlformats.org/officeDocument/2006/relationships" xmlns:v="urn:schemas-microsoft-com:vml" xmlns:w10="urn:schemas-microsoft-com:office:word" xmlns:w14="http://schemas.microsoft.com/office/word/2010/wordml" xmlns:w="http://schemas.openxmlformats.org/wordprocessingml/2006/main" xmlns:wne="http://schemas.microsoft.com/office/word/2006/wordml" xmlns:wp14="http://schemas.microsoft.com/office/word/2010/wordprocessingDrawing" xmlns:wp="http://schemas.openxmlformats.org/drawingml/2006/wordprocessingDrawing" xmlns:wpc="http://schemas.microsoft.com/office/word/2010/wordprocessingCanvas" xmlns:wpg="http://schemas.microsoft.com/office/word/2010/wordprocessingGroup" xmlns:wpi="http://schemas.microsoft.com/office/word/2010/wordprocessingInk" xmlns:wps="http://schemas.microsoft.com/office/word/2010/wordprocessingShape" mc:Ignorable="w14 wp14">
+  <w:p>
+    <w:pPr>
+      <w:pStyle w:val="Footer"/>
+      <w:jc w:val="center"/>
+    </w:pPr>
+    <w:r>
+      <w:rPr>
+        <w:rFonts w:ascii="Calibri" w:hAnsi="Calibri" w:eastAsia="Calibri"/>
+        <w:b w:val="0"/>
+        <w:color w:val="94A3B8"/>
+        <w:sz w:val="18"/>
+      </w:rPr>
+      <w:t>Generated by HEURION Clinical AI Workstation</w:t>
+    </w:r>
+    <w:r>
+      <w:t xml:space="preserve">  ·  </w:t>
+    </w:r>
+    <w:r>
+      <w:rPr>
+        <w:rFonts w:ascii="Calibri" w:hAnsi="Calibri" w:eastAsia="Calibri"/>
+        <w:b w:val="0"/>
+        <w:color w:val="94A3B8"/>
+        <w:sz w:val="18"/>
+      </w:rPr>
+      <w:t>{{generated_at}}</w:t>
+    </w:r>
+  </w:p>
+</w:ftr>
+</file>
+
+<file path=word/header1.xml><?xml version="1.0" encoding="utf-8"?>
+<w:hdr xmlns:m="http://schemas.openxmlformats.org/officeDocument/2006/math" xmlns:mc="http://schemas.openxmlformats.org/markup-compatibility/2006" xmlns:mo="http://schemas.microsoft.com/office/mac/office/2008/main" xmlns:mv="urn:schemas-microsoft-com:mac:vml" xmlns:o="urn:schemas-microsoft-com:office:office" xmlns:r="http://schemas.openxmlformats.org/officeDocument/2006/relationships" xmlns:v="urn:schemas-microsoft-com:vml" xmlns:w10="urn:schemas-microsoft-com:office:word" xmlns:w14="http://schemas.microsoft.com/office/word/2010/wordml" xmlns:w="http://schemas.openxmlformats.org/wordprocessingml/2006/main" xmlns:wne="http://schemas.microsoft.com/office/word/2006/wordml" xmlns:wp14="http://schemas.microsoft.com/office/word/2010/wordprocessingDrawing" xmlns:wp="http://schemas.openxmlformats.org/drawingml/2006/wordprocessingDrawing" xmlns:wpc="http://schemas.microsoft.com/office/word/2010/wordprocessingCanvas" xmlns:wpg="http://schemas.microsoft.com/office/word/2010/wordprocessingGroup" xmlns:wpi="http://schemas.microsoft.com/office/word/2010/wordprocessingInk" xmlns:wps="http://schemas.microsoft.com/office/word/2010/wordprocessingShape" mc:Ignorable="w14 wp14">
+  <w:p>
+    <w:pPr>
+      <w:pStyle w:val="Header"/>
+      <w:jc w:val="right"/>
+    </w:pPr>
+    <w:r>
+      <w:drawing>
+        <wp:inline xmlns:a="http://schemas.openxmlformats.org/drawingml/2006/main" xmlns:pic="http://schemas.openxmlformats.org/drawingml/2006/picture">
+          <wp:extent cx="1280160" cy="384048"/>
+          <wp:docPr id="1" name="Picture 1"/>
+          <wp:cNvGraphicFramePr>
+            <a:graphicFrameLocks noChangeAspect="1"/>
+          </wp:cNvGraphicFramePr>
+          <a:graphic>
+            <a:graphicData uri="http://schemas.openxmlformats.org/drawingml/2006/picture">
+              <pic:pic>
+                <pic:nvPicPr>
+                  <pic:cNvPr id="0" name="heurion-logo-light.png"/>
+                  <pic:cNvPicPr/>
+                </pic:nvPicPr>
+                <pic:blipFill>
+                  <a:blip r:embed="rId1"/>
+                  <a:stretch>
+                    <a:fillRect/>
+                  </a:stretch>
+                </pic:blipFill>
+                <pic:spPr>
+                  <a:xfrm>
+                    <a:off x="0" y="0"/>
+                    <a:ext cx="1280160" cy="384048"/>
+                  </a:xfrm>
+                  <a:prstGeom prst="rect"/>
+                </pic:spPr>
+              </pic:pic>
+            </a:graphicData>
+          </a:graphic>
+        </wp:inline>
+      </w:drawing>
+    </w:r>
+  </w:p>
+</w:hdr>
 </file>
 
 <file path=word/numbering.xml><?xml version="1.0" encoding="utf-8"?>
@@ -463,6 +666,11 @@
     <w:name w:val="Normal"/>
     <w:qFormat/>
     <w:rsid w:val="00FC693F"/>
+    <w:rPr>
+      <w:rFonts w:ascii="Calibri" w:hAnsi="Calibri" w:eastAsia="Calibri"/>
+      <w:color w:val="0F172A"/>
+      <w:sz w:val="22"/>
+    </w:rPr>
   </w:style>
   <w:style w:type="paragraph" w:styleId="Header">
     <w:name w:val="header"/>

</xml_diff>